<commit_message>
chore: save reports and school device handoff
Include revised competency reports, the generated manual-upload fixture,
and setup instructions for continuing on the slash branch. Record open
standup decisions without marking pending integrations complete.
</commit_message>
<xml_diff>
--- a/docs/Growing-a-Competency-CICD.docx
+++ b/docs/Growing-a-Competency-CICD.docx
@@ -68,16 +68,6 @@
         </w:rPr>
         <w:t>Skill Selection:</w:t>
       </w:r>
-    </w:p>
-    <w:p>
-      <w:pPr>
-        <w:spacing w:before="100" w:beforeAutospacing="1" w:after="100" w:afterAutospacing="1" w:line="240" w:lineRule="auto"/>
-        <w:rPr>
-          <w:rFonts w:ascii="Times New Roman" w:eastAsia="Times New Roman" w:hAnsi="Times New Roman" w:cs="Times New Roman"/>
-          <w:kern w:val="0"/>
-          <w14:ligatures w14:val="none"/>
-        </w:rPr>
-      </w:pPr>
       <w:r>
         <w:rPr>
           <w:rFonts w:ascii="Times New Roman" w:eastAsia="Times New Roman" w:hAnsi="Times New Roman" w:cs="Times New Roman"/>
@@ -86,15 +76,7 @@
           <w:kern w:val="0"/>
           <w14:ligatures w14:val="none"/>
         </w:rPr>
-        <w:t>Chosen Skill:</w:t>
-      </w:r>
-      <w:r>
-        <w:rPr>
-          <w:rFonts w:ascii="Times New Roman" w:eastAsia="Times New Roman" w:hAnsi="Times New Roman" w:cs="Times New Roman"/>
-          <w:kern w:val="0"/>
-          <w14:ligatures w14:val="none"/>
-        </w:rPr>
-        <w:t xml:space="preserve"> CI/CD Pipeline with GitHub Actions &amp; Docker</w:t>
+        <w:t xml:space="preserve"> </w:t>
       </w:r>
     </w:p>
     <w:p>
@@ -114,6 +96,42 @@
           <w:kern w:val="0"/>
           <w14:ligatures w14:val="none"/>
         </w:rPr>
+        <w:t>Chosen Skill:</w:t>
+      </w:r>
+      <w:r>
+        <w:rPr>
+          <w:rFonts w:ascii="Times New Roman" w:eastAsia="Times New Roman" w:hAnsi="Times New Roman" w:cs="Times New Roman"/>
+          <w:kern w:val="0"/>
+          <w14:ligatures w14:val="none"/>
+        </w:rPr>
+        <w:t xml:space="preserve"> </w:t>
+      </w:r>
+      <w:r>
+        <w:rPr>
+          <w:rFonts w:ascii="Times New Roman" w:eastAsia="Times New Roman" w:hAnsi="Times New Roman" w:cs="Times New Roman"/>
+          <w:kern w:val="0"/>
+          <w14:ligatures w14:val="none"/>
+        </w:rPr>
+        <w:t>CI/CD Pipeline with GitHub Actions &amp; Docker</w:t>
+      </w:r>
+    </w:p>
+    <w:p>
+      <w:pPr>
+        <w:spacing w:before="100" w:beforeAutospacing="1" w:after="100" w:afterAutospacing="1" w:line="240" w:lineRule="auto"/>
+        <w:rPr>
+          <w:rFonts w:ascii="Times New Roman" w:eastAsia="Times New Roman" w:hAnsi="Times New Roman" w:cs="Times New Roman"/>
+          <w:kern w:val="0"/>
+          <w14:ligatures w14:val="none"/>
+        </w:rPr>
+      </w:pPr>
+      <w:r>
+        <w:rPr>
+          <w:rFonts w:ascii="Times New Roman" w:eastAsia="Times New Roman" w:hAnsi="Times New Roman" w:cs="Times New Roman"/>
+          <w:b/>
+          <w:bCs/>
+          <w:kern w:val="0"/>
+          <w14:ligatures w14:val="none"/>
+        </w:rPr>
         <w:t>Relevance:</w:t>
       </w:r>
       <w:r>
@@ -122,7 +140,25 @@
           <w:kern w:val="0"/>
           <w14:ligatures w14:val="none"/>
         </w:rPr>
-        <w:t xml:space="preserve"> I chose to learn CI/CD with GitHub Actions and Docker because it directly supports my capstone project and future career. Our Banner Health capstone turns photographed EKG printouts into data for cardiac risk research: capture the image, de-identify it, digitize the waveform, measure T-waves, and later score risk. Teammates change the image-handling code every sprint, yet our repository had no automated checks. This skill tests every push before it reaches a shared branch, and Docker gives every teammate and server the same runtime for the image-processing services we will add. For a career in backend and health-tech software, both are baseline expectations. Before this, I had never written a workflow file or a Dockerfile.</w:t>
+        <w:t xml:space="preserve"> I chose to learn CI/CD with GitHub Actions and Docker because it directly supports my capstone project and future career. Our Banner Health capstone turns photographed EKG printouts into data for cardiac risk research: capture the image, de-identify it, digitize the waveform, measure T-waves, and later score risk. Teammates change the image-handling code every sprint, yet our repository had no automated checks. This skill tests every push before it reaches a shared branch, and Docker gives every teammate and server the same runtime for the image-processing services we will add. For a career in backend and health-tech software, both are baseline expectations. Before this, I had never written a workflow file or a </w:t>
+      </w:r>
+      <w:proofErr w:type="spellStart"/>
+      <w:r>
+        <w:rPr>
+          <w:rFonts w:ascii="Times New Roman" w:eastAsia="Times New Roman" w:hAnsi="Times New Roman" w:cs="Times New Roman"/>
+          <w:kern w:val="0"/>
+          <w14:ligatures w14:val="none"/>
+        </w:rPr>
+        <w:t>Dockerfile</w:t>
+      </w:r>
+      <w:proofErr w:type="spellEnd"/>
+      <w:r>
+        <w:rPr>
+          <w:rFonts w:ascii="Times New Roman" w:eastAsia="Times New Roman" w:hAnsi="Times New Roman" w:cs="Times New Roman"/>
+          <w:kern w:val="0"/>
+          <w14:ligatures w14:val="none"/>
+        </w:rPr>
+        <w:t>.</w:t>
       </w:r>
     </w:p>
     <w:p>
@@ -322,7 +358,25 @@
           <w:kern w:val="0"/>
           <w14:ligatures w14:val="none"/>
         </w:rPr>
-        <w:t xml:space="preserve"> FastAPI’s “Request Files” tutorial and the actions/checkout and actions/setup-python READMEs - These covered file uploads, action versions, and caching.</w:t>
+        <w:t xml:space="preserve"> </w:t>
+      </w:r>
+      <w:proofErr w:type="spellStart"/>
+      <w:r>
+        <w:rPr>
+          <w:rFonts w:ascii="Times New Roman" w:eastAsia="Times New Roman" w:hAnsi="Times New Roman" w:cs="Times New Roman"/>
+          <w:kern w:val="0"/>
+          <w14:ligatures w14:val="none"/>
+        </w:rPr>
+        <w:t>FastAPI’s</w:t>
+      </w:r>
+      <w:proofErr w:type="spellEnd"/>
+      <w:r>
+        <w:rPr>
+          <w:rFonts w:ascii="Times New Roman" w:eastAsia="Times New Roman" w:hAnsi="Times New Roman" w:cs="Times New Roman"/>
+          <w:kern w:val="0"/>
+          <w14:ligatures w14:val="none"/>
+        </w:rPr>
+        <w:t xml:space="preserve"> “Request Files” tutorial and the actions/checkout and actions/setup-python READMEs - These covered file uploads, action versions, and caching.</w:t>
       </w:r>
     </w:p>
     <w:p>
@@ -430,6 +484,7 @@
           <w:kern w:val="0"/>
           <w14:ligatures w14:val="none"/>
         </w:rPr>
+        <w:lastRenderedPageBreak/>
         <w:t>Step 1:</w:t>
       </w:r>
       <w:r>
@@ -470,7 +525,43 @@
           <w:kern w:val="0"/>
           <w14:ligatures w14:val="none"/>
         </w:rPr>
-        <w:t xml:space="preserve"> Built a FastAPI upload service with 14 pytest tests that use synthetic EKG-style images.</w:t>
+        <w:t xml:space="preserve"> Built a </w:t>
+      </w:r>
+      <w:proofErr w:type="spellStart"/>
+      <w:r>
+        <w:rPr>
+          <w:rFonts w:ascii="Times New Roman" w:eastAsia="Times New Roman" w:hAnsi="Times New Roman" w:cs="Times New Roman"/>
+          <w:kern w:val="0"/>
+          <w14:ligatures w14:val="none"/>
+        </w:rPr>
+        <w:t>FastAPI</w:t>
+      </w:r>
+      <w:proofErr w:type="spellEnd"/>
+      <w:r>
+        <w:rPr>
+          <w:rFonts w:ascii="Times New Roman" w:eastAsia="Times New Roman" w:hAnsi="Times New Roman" w:cs="Times New Roman"/>
+          <w:kern w:val="0"/>
+          <w14:ligatures w14:val="none"/>
+        </w:rPr>
+        <w:t xml:space="preserve"> upload service with 14 </w:t>
+      </w:r>
+      <w:proofErr w:type="spellStart"/>
+      <w:r>
+        <w:rPr>
+          <w:rFonts w:ascii="Times New Roman" w:eastAsia="Times New Roman" w:hAnsi="Times New Roman" w:cs="Times New Roman"/>
+          <w:kern w:val="0"/>
+          <w14:ligatures w14:val="none"/>
+        </w:rPr>
+        <w:t>pytest</w:t>
+      </w:r>
+      <w:proofErr w:type="spellEnd"/>
+      <w:r>
+        <w:rPr>
+          <w:rFonts w:ascii="Times New Roman" w:eastAsia="Times New Roman" w:hAnsi="Times New Roman" w:cs="Times New Roman"/>
+          <w:kern w:val="0"/>
+          <w14:ligatures w14:val="none"/>
+        </w:rPr>
+        <w:t xml:space="preserve"> tests that use synthetic EKG-style images.</w:t>
       </w:r>
     </w:p>
     <w:p>
@@ -502,7 +593,25 @@
           <w:kern w:val="0"/>
           <w14:ligatures w14:val="none"/>
         </w:rPr>
-        <w:t xml:space="preserve"> Installed Docker Desktop, wrote a Dockerfile (slim base, pinned dependencies, non-root user, health check), and ran the container.</w:t>
+        <w:t xml:space="preserve"> Installed Docker Desktop, wrote a </w:t>
+      </w:r>
+      <w:proofErr w:type="spellStart"/>
+      <w:r>
+        <w:rPr>
+          <w:rFonts w:ascii="Times New Roman" w:eastAsia="Times New Roman" w:hAnsi="Times New Roman" w:cs="Times New Roman"/>
+          <w:kern w:val="0"/>
+          <w14:ligatures w14:val="none"/>
+        </w:rPr>
+        <w:t>Dockerfile</w:t>
+      </w:r>
+      <w:proofErr w:type="spellEnd"/>
+      <w:r>
+        <w:rPr>
+          <w:rFonts w:ascii="Times New Roman" w:eastAsia="Times New Roman" w:hAnsi="Times New Roman" w:cs="Times New Roman"/>
+          <w:kern w:val="0"/>
+          <w14:ligatures w14:val="none"/>
+        </w:rPr>
+        <w:t xml:space="preserve"> (slim base, pinned dependencies, non-root user, health check), and ran the container.</w:t>
       </w:r>
     </w:p>
     <w:p>
@@ -552,7 +661,6 @@
           <w:noProof/>
           <w:kern w:val="0"/>
         </w:rPr>
-        <w:lastRenderedPageBreak/>
         <w:pict w14:anchorId="3184DC95">
           <v:rect id="_x0000_i1028" alt="" style="width:468pt;height:.05pt;mso-width-percent:0;mso-height-percent:0;mso-width-percent:0;mso-height-percent:0" o:hralign="center" o:hrstd="t" o:hr="t" fillcolor="#a0a0a0" stroked="f"/>
         </w:pict>
@@ -623,7 +731,7 @@
           <w:kern w:val="0"/>
         </w:rPr>
         <w:drawing>
-          <wp:inline distT="0" distB="0" distL="0" distR="0" wp14:anchorId="2F6DD1D5" wp14:editId="469937D4">
+          <wp:inline distT="0" distB="0" distL="0" distR="0" wp14:anchorId="2F6DD1D5" wp14:editId="6A103252">
             <wp:extent cx="5943600" cy="1760855"/>
             <wp:effectExtent l="0" t="0" r="0" b="0"/>
             <wp:docPr id="906916481" name="Picture 3"/>
@@ -705,7 +813,7 @@
           <w:kern w:val="0"/>
         </w:rPr>
         <w:drawing>
-          <wp:inline distT="0" distB="0" distL="0" distR="0" wp14:anchorId="5ECE0A89" wp14:editId="446DE28E">
+          <wp:inline distT="0" distB="0" distL="0" distR="0" wp14:anchorId="5ECE0A89" wp14:editId="6C789C47">
             <wp:extent cx="5943600" cy="1760855"/>
             <wp:effectExtent l="0" t="0" r="0" b="0"/>
             <wp:docPr id="621452599" name="Picture 2"/>
@@ -767,7 +875,29 @@
           <w:sz w:val="20"/>
           <w14:ligatures w14:val="none"/>
         </w:rPr>
-        <w:t>Figure 2: With one test broken on purpose, the test job fails and GitHub skips the Docker build, so failing code is never packaged.</w:t>
+        <w:t xml:space="preserve">Figure 2: With one test broken on purpose, the test job </w:t>
+      </w:r>
+      <w:proofErr w:type="gramStart"/>
+      <w:r>
+        <w:rPr>
+          <w:rFonts w:ascii="Times New Roman" w:eastAsia="Times New Roman" w:hAnsi="Times New Roman" w:cs="Times New Roman"/>
+          <w:i/>
+          <w:kern w:val="0"/>
+          <w:sz w:val="20"/>
+          <w14:ligatures w14:val="none"/>
+        </w:rPr>
+        <w:t>fails</w:t>
+      </w:r>
+      <w:proofErr w:type="gramEnd"/>
+      <w:r>
+        <w:rPr>
+          <w:rFonts w:ascii="Times New Roman" w:eastAsia="Times New Roman" w:hAnsi="Times New Roman" w:cs="Times New Roman"/>
+          <w:i/>
+          <w:kern w:val="0"/>
+          <w:sz w:val="20"/>
+          <w14:ligatures w14:val="none"/>
+        </w:rPr>
+        <w:t xml:space="preserve"> and GitHub skips the Docker build, so failing code is never packaged.</w:t>
       </w:r>
     </w:p>
     <w:p>
@@ -786,6 +916,7 @@
           <w:noProof/>
           <w:kern w:val="0"/>
         </w:rPr>
+        <w:lastRenderedPageBreak/>
         <w:drawing>
           <wp:inline distT="0" distB="0" distL="0" distR="0" wp14:anchorId="57ECCC23" wp14:editId="66F5F18F">
             <wp:extent cx="5943600" cy="1889125"/>
@@ -895,7 +1026,25 @@
           <w:kern w:val="0"/>
           <w14:ligatures w14:val="none"/>
         </w:rPr>
-        <w:t xml:space="preserve"> This project is significant because it is the first server-side piece of our own capstone pipeline, not a tutorial app. It reuses our team’s resolution rule so the API and capture screen agree, and its design follows our clinical context: images stay in memory, nothing is logged, test images are synthetic, and every response states the image was not verified as an EKG. Unlike a simple tutorial, this project required me to stop the framework from silently writing uploads over 1 MB to disk, reject truncated JPEGs that pass Pillow’s quick check, and prove with a failing test that the pipeline blocks bad code. It does not de-identify, extract waveforms, or predict risk.</w:t>
+        <w:t xml:space="preserve"> This project is significant because it is the first server-side piece of our own capstone pipeline, not a tutorial app. It reuses our team’s resolution </w:t>
+      </w:r>
+      <w:proofErr w:type="gramStart"/>
+      <w:r>
+        <w:rPr>
+          <w:rFonts w:ascii="Times New Roman" w:eastAsia="Times New Roman" w:hAnsi="Times New Roman" w:cs="Times New Roman"/>
+          <w:kern w:val="0"/>
+          <w14:ligatures w14:val="none"/>
+        </w:rPr>
+        <w:t>rule</w:t>
+      </w:r>
+      <w:proofErr w:type="gramEnd"/>
+      <w:r>
+        <w:rPr>
+          <w:rFonts w:ascii="Times New Roman" w:eastAsia="Times New Roman" w:hAnsi="Times New Roman" w:cs="Times New Roman"/>
+          <w:kern w:val="0"/>
+          <w14:ligatures w14:val="none"/>
+        </w:rPr>
+        <w:t xml:space="preserve"> so the API and capture screen agree, and its design follows our clinical context: images stay in memory, nothing is logged, test images are synthetic, and every response states the image was not verified as an EKG. Unlike a simple tutorial, this project required me to stop the framework from silently writing uploads over 1 MB to disk, reject truncated JPEGs that pass Pillow’s quick check, and prove with a failing test that the pipeline blocks bad code. It does not de-identify, extract waveforms, or predict risk.</w:t>
       </w:r>
     </w:p>
     <w:p>
@@ -963,7 +1112,43 @@
           <w:kern w:val="0"/>
           <w14:ligatures w14:val="none"/>
         </w:rPr>
-        <w:t xml:space="preserve"> While learning CI/CD with GitHub Actions and Docker, I encountered several challenges, including problems that never showed up as errors. For example, FastAPI’s framework quietly writes uploads over 1 MB to disk; I found this only by reading its source, raised the limit, and confirmed a 9 MB upload stayed in memory. Pillow’s verify() also accepted a truncated JPEG, so I added a full decode and a test. These challenges taught me the importance of testing edge cases on purpose and checking defaults.</w:t>
+        <w:t xml:space="preserve"> While learning CI/CD with GitHub Actions and Docker, I encountered several challenges, including problems that never showed up as errors. For example, </w:t>
+      </w:r>
+      <w:proofErr w:type="spellStart"/>
+      <w:r>
+        <w:rPr>
+          <w:rFonts w:ascii="Times New Roman" w:eastAsia="Times New Roman" w:hAnsi="Times New Roman" w:cs="Times New Roman"/>
+          <w:kern w:val="0"/>
+          <w14:ligatures w14:val="none"/>
+        </w:rPr>
+        <w:t>FastAPI’s</w:t>
+      </w:r>
+      <w:proofErr w:type="spellEnd"/>
+      <w:r>
+        <w:rPr>
+          <w:rFonts w:ascii="Times New Roman" w:eastAsia="Times New Roman" w:hAnsi="Times New Roman" w:cs="Times New Roman"/>
+          <w:kern w:val="0"/>
+          <w14:ligatures w14:val="none"/>
+        </w:rPr>
+        <w:t xml:space="preserve"> framework quietly writes uploads over 1 MB to disk; I found this only by reading its source, raised the limit, and confirmed a 9 MB upload stayed in memory. </w:t>
+      </w:r>
+      <w:proofErr w:type="gramStart"/>
+      <w:r>
+        <w:rPr>
+          <w:rFonts w:ascii="Times New Roman" w:eastAsia="Times New Roman" w:hAnsi="Times New Roman" w:cs="Times New Roman"/>
+          <w:kern w:val="0"/>
+          <w14:ligatures w14:val="none"/>
+        </w:rPr>
+        <w:t>Pillow’s</w:t>
+      </w:r>
+      <w:proofErr w:type="gramEnd"/>
+      <w:r>
+        <w:rPr>
+          <w:rFonts w:ascii="Times New Roman" w:eastAsia="Times New Roman" w:hAnsi="Times New Roman" w:cs="Times New Roman"/>
+          <w:kern w:val="0"/>
+          <w14:ligatures w14:val="none"/>
+        </w:rPr>
+        <w:t xml:space="preserve"> verify() also accepted a truncated JPEG, so I added a full decode and a test. These challenges taught me the importance of testing edge cases on purpose and checking defaults.</w:t>
       </w:r>
     </w:p>
     <w:p>

</xml_diff>